<commit_message>
docs(archive): keep only the authoritative Feishu doc as single source of truth
</commit_message>
<xml_diff>
--- a/ANS-Day01-P5Brush-Skill-Workflow-Handoff.feishu-import.docx
+++ b/ANS-Day01-P5Brush-Skill-Workflow-Handoff.feishu-import.docx
@@ -22,7 +22,7 @@
     </w:p>
     <w:p>
       <w:r>
-        <w:t>V1 飞书在线文档：https://narcb9vct6.feishu.cn/wiki/EcBsw9QWzigqIVkBQnKcf8sQnvb</w:t>
+        <w:t>飞书在线云文档（唯一权威版 · 即本文档）：https://narcb9vct6.feishu.cn/wiki/EaHAwTrKQiwR4akgb9OcTZi3nAh</w:t>
       </w:r>
     </w:p>
     <w:p>
@@ -248,7 +248,7 @@
           </w:tcPr>
           <w:p>
             <w:r>
-              <w:t>飞书在线云文档</w:t>
+              <w:t>飞书在线云文档（唯一权威版）</w:t>
             </w:r>
           </w:p>
         </w:tc>
@@ -258,7 +258,7 @@
           </w:tcPr>
           <w:p>
             <w:r>
-              <w:t>V1：https://narcb9vct6.feishu.cn/wiki/EcBsw9QWzigqIVkBQnKcf8sQnvb （含内嵌高清设定图与 5 幕关键帧）</w:t>
+              <w:t>https://narcb9vct6.feishu.cn/wiki/EaHAwTrKQiwR4akgb9OcTZi3nAh （含内嵌高清设定图与 5 幕关键帧）</w:t>
             </w:r>
           </w:p>
         </w:tc>
@@ -416,7 +416,7 @@
     </w:p>
     <w:p>
       <w:r>
-        <w:t>• 仓库地址：https://github.com/1008611-creater/ans-platform （分支：feat/dev3-ans-skill-refactor，提交：cbfad813）</w:t>
+        <w:t>• 仓库地址：https://github.com/1008611-creater/ans-platform （分支：feat/dev3-ans-skill-refactor，最新提交以远端分支为准）</w:t>
       </w:r>
     </w:p>
     <w:p>

</xml_diff>